<commit_message>
Update weekly recap docx with corrected version
</commit_message>
<xml_diff>
--- a/assets/Mortise_Capital_Weekly_Recap_Jun22-26_2026.docx
+++ b/assets/Mortise_Capital_Weekly_Recap_Jun22-26_2026.docx
@@ -400,7 +400,7 @@
               </w:pBdr>
               <w:spacing w:after="100"/>
               <w:rPr>
-                <w:rFonts w:ascii="Microsoft JhengHei" w:eastAsia="Microsoft JhengHei" w:hAnsi="Microsoft JhengHei" w:cs="Microsoft JhengHei"/>
+                <w:rFonts w:ascii="微軟正黑體" w:eastAsia="微軟正黑體" w:hAnsi="微軟正黑體" w:cs="微軟正黑體"/>
               </w:rPr>
             </w:pPr>
             <w:r>
@@ -1482,7 +1482,7 @@
                 <w:p>
                   <w:pPr>
                     <w:rPr>
-                      <w:rFonts w:ascii="Microsoft JhengHei" w:eastAsia="Microsoft JhengHei" w:hAnsi="Microsoft JhengHei" w:cs="Microsoft JhengHei"/>
+                      <w:rFonts w:ascii="微軟正黑體" w:eastAsia="微軟正黑體" w:hAnsi="微軟正黑體" w:cs="微軟正黑體"/>
                       <w:sz w:val="16"/>
                       <w:szCs w:val="16"/>
                     </w:rPr>
@@ -3949,13 +3949,21 @@
                   <w:pPr>
                     <w:wordWrap w:val="0"/>
                     <w:jc w:val="right"/>
+                    <w:rPr>
+                      <w:rFonts w:eastAsia="Gill Sans MT"/>
+                      <w:b/>
+                      <w:bCs/>
+                      <w:color w:val="8B2020"/>
+                      <w:sz w:val="14"/>
+                      <w:szCs w:val="14"/>
+                    </w:rPr>
                   </w:pPr>
                   <w:r>
                     <w:rPr>
                       <w:rFonts w:ascii="Arial" w:eastAsia="Gill Sans MT" w:hAnsi="Arial" w:cs="Arial"/>
                       <w:b/>
                       <w:bCs/>
-                      <w:color w:val="8B2020"/>
+                      <w:color w:val="1A5C3A"/>
                       <w:sz w:val="14"/>
                       <w:szCs w:val="14"/>
                     </w:rPr>
@@ -3966,7 +3974,7 @@
                       <w:rFonts w:eastAsia="Gill Sans MT"/>
                       <w:b/>
                       <w:bCs/>
-                      <w:color w:val="8B2020"/>
+                      <w:color w:val="1A5C3A"/>
                       <w:sz w:val="14"/>
                       <w:szCs w:val="14"/>
                     </w:rPr>
@@ -4073,14 +4081,23 @@
                 </w:tcPr>
                 <w:p>
                   <w:pPr>
+                    <w:wordWrap w:val="0"/>
                     <w:jc w:val="right"/>
+                    <w:rPr>
+                      <w:rFonts w:eastAsia="Gill Sans MT"/>
+                      <w:b/>
+                      <w:bCs/>
+                      <w:color w:val="275317" w:themeColor="accent6" w:themeShade="80"/>
+                      <w:sz w:val="14"/>
+                      <w:szCs w:val="14"/>
+                    </w:rPr>
                   </w:pPr>
                   <w:r>
                     <w:rPr>
                       <w:rFonts w:ascii="Arial" w:eastAsia="Gill Sans MT" w:hAnsi="Arial" w:cs="Arial"/>
                       <w:b/>
                       <w:bCs/>
-                      <w:color w:val="8B2020"/>
+                      <w:color w:val="275317" w:themeColor="accent6" w:themeShade="80"/>
                       <w:sz w:val="14"/>
                       <w:szCs w:val="14"/>
                     </w:rPr>
@@ -4091,7 +4108,7 @@
                       <w:rFonts w:eastAsia="Gill Sans MT"/>
                       <w:b/>
                       <w:bCs/>
-                      <w:color w:val="8B2020"/>
+                      <w:color w:val="275317" w:themeColor="accent6" w:themeShade="80"/>
                       <w:sz w:val="14"/>
                       <w:szCs w:val="14"/>
                     </w:rPr>
@@ -4102,7 +4119,7 @@
                       <w:rFonts w:eastAsia="Gill Sans MT"/>
                       <w:b/>
                       <w:bCs/>
-                      <w:color w:val="8B2020"/>
+                      <w:color w:val="275317" w:themeColor="accent6" w:themeShade="80"/>
                       <w:sz w:val="14"/>
                       <w:szCs w:val="14"/>
                     </w:rPr>
@@ -4113,7 +4130,7 @@
                       <w:rFonts w:eastAsia="Gill Sans MT"/>
                       <w:b/>
                       <w:bCs/>
-                      <w:color w:val="8B2020"/>
+                      <w:color w:val="275317" w:themeColor="accent6" w:themeShade="80"/>
                       <w:sz w:val="14"/>
                       <w:szCs w:val="14"/>
                     </w:rPr>
@@ -4229,14 +4246,23 @@
                 </w:tcPr>
                 <w:p>
                   <w:pPr>
+                    <w:wordWrap w:val="0"/>
                     <w:jc w:val="right"/>
+                    <w:rPr>
+                      <w:rFonts w:eastAsia="Gill Sans MT"/>
+                      <w:b/>
+                      <w:bCs/>
+                      <w:color w:val="275317" w:themeColor="accent6" w:themeShade="80"/>
+                      <w:sz w:val="14"/>
+                      <w:szCs w:val="14"/>
+                    </w:rPr>
                   </w:pPr>
                   <w:r>
                     <w:rPr>
                       <w:rFonts w:ascii="Arial" w:eastAsia="Gill Sans MT" w:hAnsi="Arial" w:cs="Arial"/>
                       <w:b/>
                       <w:bCs/>
-                      <w:color w:val="8B2020"/>
+                      <w:color w:val="275317" w:themeColor="accent6" w:themeShade="80"/>
                       <w:sz w:val="14"/>
                       <w:szCs w:val="14"/>
                     </w:rPr>
@@ -4247,7 +4273,7 @@
                       <w:rFonts w:eastAsia="Gill Sans MT"/>
                       <w:b/>
                       <w:bCs/>
-                      <w:color w:val="8B2020"/>
+                      <w:color w:val="275317" w:themeColor="accent6" w:themeShade="80"/>
                       <w:sz w:val="14"/>
                       <w:szCs w:val="14"/>
                     </w:rPr>
@@ -4258,7 +4284,7 @@
                       <w:rFonts w:eastAsia="Gill Sans MT" w:hint="eastAsia"/>
                       <w:b/>
                       <w:bCs/>
-                      <w:color w:val="8B2020"/>
+                      <w:color w:val="275317" w:themeColor="accent6" w:themeShade="80"/>
                       <w:sz w:val="14"/>
                       <w:szCs w:val="14"/>
                     </w:rPr>
@@ -4269,7 +4295,7 @@
                       <w:rFonts w:eastAsia="Gill Sans MT"/>
                       <w:b/>
                       <w:bCs/>
-                      <w:color w:val="8B2020"/>
+                      <w:color w:val="275317" w:themeColor="accent6" w:themeShade="80"/>
                       <w:sz w:val="14"/>
                       <w:szCs w:val="14"/>
                     </w:rPr>

</xml_diff>